<commit_message>
add lab from 5.1 to 6.2
</commit_message>
<xml_diff>
--- a/COS30045 4.1 Design Studio.docx
+++ b/COS30045 4.1 Design Studio.docx
@@ -514,10 +514,91 @@
     </w:p>
     <w:p>
       <w:pPr>
+        <w:pStyle w:val="Body"/>
+      </w:pPr>
+    </w:p>
+    <w:p>
+      <w:pPr>
+        <w:pStyle w:val="Body"/>
+      </w:pPr>
+    </w:p>
+    <w:p>
+      <w:pPr>
+        <w:pStyle w:val="Body"/>
+      </w:pPr>
+    </w:p>
+    <w:p>
+      <w:pPr>
+        <w:pStyle w:val="Body"/>
+      </w:pPr>
+      <w:r>
+        <w:rPr>
+          <w:noProof/>
+        </w:rPr>
+        <w:lastRenderedPageBreak/>
+        <w:drawing>
+          <wp:inline distT="0" distB="0" distL="0" distR="0" wp14:anchorId="13BCD925" wp14:editId="6EDC4452">
+            <wp:extent cx="6231890" cy="3716020"/>
+            <wp:effectExtent l="0" t="0" r="0" b="0"/>
+            <wp:docPr id="1937600160" name="Picture 1"/>
+            <wp:cNvGraphicFramePr>
+              <a:graphicFrameLocks xmlns:a="http://schemas.openxmlformats.org/drawingml/2006/main" noChangeAspect="1"/>
+            </wp:cNvGraphicFramePr>
+            <a:graphic xmlns:a="http://schemas.openxmlformats.org/drawingml/2006/main">
+              <a:graphicData uri="http://schemas.openxmlformats.org/drawingml/2006/picture">
+                <pic:pic xmlns:pic="http://schemas.openxmlformats.org/drawingml/2006/picture">
+                  <pic:nvPicPr>
+                    <pic:cNvPr id="1937600160" name="Picture 1937600160"/>
+                    <pic:cNvPicPr/>
+                  </pic:nvPicPr>
+                  <pic:blipFill>
+                    <a:blip r:embed="rId8">
+                      <a:extLst>
+                        <a:ext uri="{28A0092B-C50C-407E-A947-70E740481C1C}">
+                          <a14:useLocalDpi xmlns:a14="http://schemas.microsoft.com/office/drawing/2010/main" val="0"/>
+                        </a:ext>
+                      </a:extLst>
+                    </a:blip>
+                    <a:stretch>
+                      <a:fillRect/>
+                    </a:stretch>
+                  </pic:blipFill>
+                  <pic:spPr>
+                    <a:xfrm>
+                      <a:off x="0" y="0"/>
+                      <a:ext cx="6231890" cy="3716020"/>
+                    </a:xfrm>
+                    <a:prstGeom prst="rect">
+                      <a:avLst/>
+                    </a:prstGeom>
+                  </pic:spPr>
+                </pic:pic>
+              </a:graphicData>
+            </a:graphic>
+          </wp:inline>
+        </w:drawing>
+      </w:r>
+    </w:p>
+    <w:p>
+      <w:pPr>
+        <w:pStyle w:val="Body"/>
+      </w:pPr>
+    </w:p>
+    <w:p>
+      <w:pPr>
+        <w:pStyle w:val="Body"/>
+      </w:pPr>
+    </w:p>
+    <w:p>
+      <w:pPr>
+        <w:pStyle w:val="Body"/>
+      </w:pPr>
+    </w:p>
+    <w:p>
+      <w:pPr>
         <w:pStyle w:val="SubTitle"/>
       </w:pPr>
       <w:r>
-        <w:lastRenderedPageBreak/>
         <w:t>Question 2</w:t>
       </w:r>
       <w:r>
@@ -680,6 +761,54 @@
     </w:p>
     <w:p>
       <w:pPr>
+        <w:pStyle w:val="Body"/>
+      </w:pPr>
+      <w:r>
+        <w:lastRenderedPageBreak/>
+        <w:drawing>
+          <wp:inline distT="0" distB="0" distL="0" distR="0" wp14:anchorId="6FE342D6" wp14:editId="672963CE">
+            <wp:extent cx="6032269" cy="4739640"/>
+            <wp:effectExtent l="0" t="0" r="6985" b="3810"/>
+            <wp:docPr id="196798978" name="Picture 1" descr="A pie chart with numbers and text with Crust in the background&#10;&#10;Description automatically generated"/>
+            <wp:cNvGraphicFramePr>
+              <a:graphicFrameLocks xmlns:a="http://schemas.openxmlformats.org/drawingml/2006/main" noChangeAspect="1"/>
+            </wp:cNvGraphicFramePr>
+            <a:graphic xmlns:a="http://schemas.openxmlformats.org/drawingml/2006/main">
+              <a:graphicData uri="http://schemas.openxmlformats.org/drawingml/2006/picture">
+                <pic:pic xmlns:pic="http://schemas.openxmlformats.org/drawingml/2006/picture">
+                  <pic:nvPicPr>
+                    <pic:cNvPr id="196798978" name="Picture 1" descr="A pie chart with numbers and text with Crust in the background&#10;&#10;Description automatically generated"/>
+                    <pic:cNvPicPr/>
+                  </pic:nvPicPr>
+                  <pic:blipFill>
+                    <a:blip r:embed="rId9"/>
+                    <a:stretch>
+                      <a:fillRect/>
+                    </a:stretch>
+                  </pic:blipFill>
+                  <pic:spPr>
+                    <a:xfrm>
+                      <a:off x="0" y="0"/>
+                      <a:ext cx="6042796" cy="4747911"/>
+                    </a:xfrm>
+                    <a:prstGeom prst="rect">
+                      <a:avLst/>
+                    </a:prstGeom>
+                  </pic:spPr>
+                </pic:pic>
+              </a:graphicData>
+            </a:graphic>
+          </wp:inline>
+        </w:drawing>
+      </w:r>
+    </w:p>
+    <w:p>
+      <w:pPr>
+        <w:pStyle w:val="Body"/>
+      </w:pPr>
+    </w:p>
+    <w:p>
+      <w:pPr>
         <w:pStyle w:val="SubTitle"/>
       </w:pPr>
       <w:r>
@@ -844,11 +973,62 @@
         <w:t>We</w:t>
       </w:r>
       <w:r>
-        <w:t xml:space="preserve"> can see at a glance how each crash type correlates with the involvement of heavy vehicles.</w:t>
+        <w:t xml:space="preserve"> can see </w:t>
+      </w:r>
+      <w:proofErr w:type="gramStart"/>
+      <w:r>
+        <w:t>at a glance</w:t>
+      </w:r>
+      <w:proofErr w:type="gramEnd"/>
+      <w:r>
+        <w:t xml:space="preserve"> how each crash type correlates with the involvement of heavy vehicles.</w:t>
+      </w:r>
+    </w:p>
+    <w:p>
+      <w:pPr>
+        <w:pStyle w:val="Body"/>
+      </w:pPr>
+      <w:r>
+        <w:lastRenderedPageBreak/>
+        <w:drawing>
+          <wp:inline distT="0" distB="0" distL="0" distR="0" wp14:anchorId="2D591EB0" wp14:editId="69DBA16A">
+            <wp:extent cx="6231890" cy="3539490"/>
+            <wp:effectExtent l="0" t="0" r="0" b="3810"/>
+            <wp:docPr id="836016403" name="Picture 1" descr="A graph of a crash type and heavy vehicle involved&#10;&#10;Description automatically generated"/>
+            <wp:cNvGraphicFramePr>
+              <a:graphicFrameLocks xmlns:a="http://schemas.openxmlformats.org/drawingml/2006/main" noChangeAspect="1"/>
+            </wp:cNvGraphicFramePr>
+            <a:graphic xmlns:a="http://schemas.openxmlformats.org/drawingml/2006/main">
+              <a:graphicData uri="http://schemas.openxmlformats.org/drawingml/2006/picture">
+                <pic:pic xmlns:pic="http://schemas.openxmlformats.org/drawingml/2006/picture">
+                  <pic:nvPicPr>
+                    <pic:cNvPr id="836016403" name="Picture 1" descr="A graph of a crash type and heavy vehicle involved&#10;&#10;Description automatically generated"/>
+                    <pic:cNvPicPr/>
+                  </pic:nvPicPr>
+                  <pic:blipFill>
+                    <a:blip r:embed="rId10"/>
+                    <a:stretch>
+                      <a:fillRect/>
+                    </a:stretch>
+                  </pic:blipFill>
+                  <pic:spPr>
+                    <a:xfrm>
+                      <a:off x="0" y="0"/>
+                      <a:ext cx="6231890" cy="3539490"/>
+                    </a:xfrm>
+                    <a:prstGeom prst="rect">
+                      <a:avLst/>
+                    </a:prstGeom>
+                  </pic:spPr>
+                </pic:pic>
+              </a:graphicData>
+            </a:graphic>
+          </wp:inline>
+        </w:drawing>
       </w:r>
     </w:p>
     <w:sectPr>
-      <w:footerReference w:type="even" r:id="rId8"/>
+      <w:footerReference w:type="even" r:id="rId11"/>
       <w:pgSz w:w="11900" w:h="16840"/>
       <w:pgMar w:top="674" w:right="1134" w:bottom="505" w:left="952" w:header="709" w:footer="283" w:gutter="0"/>
       <w:cols w:space="720"/>

</xml_diff>